<commit_message>
maj style rapport DATA
</commit_message>
<xml_diff>
--- a/rendu/data/Rapport_DATA_Saidou_COUMARE.docx
+++ b/rendu/data/Rapport_DATA_Saidou_COUMARE.docx
@@ -2,77 +2,113 @@
 <file path=word/document.xml><?xml version="1.0" encoding="utf-8"?>
 <w:document xmlns:wpc="http://schemas.microsoft.com/office/word/2010/wordprocessingCanvas" xmlns:mo="http://schemas.microsoft.com/office/mac/office/2008/main" xmlns:mc="http://schemas.openxmlformats.org/markup-compatibility/2006" xmlns:mv="urn:schemas-microsoft-com:mac:vml" xmlns:o="urn:schemas-microsoft-com:office:office" xmlns:r="http://schemas.openxmlformats.org/officeDocument/2006/relationships" xmlns:m="http://schemas.openxmlformats.org/officeDocument/2006/math" xmlns:v="urn:schemas-microsoft-com:vml" xmlns:wp14="http://schemas.microsoft.com/office/word/2010/wordprocessingDrawing" xmlns:wp="http://schemas.openxmlformats.org/drawingml/2006/wordprocessingDrawing" xmlns:w10="urn:schemas-microsoft-com:office:word" xmlns:w="http://schemas.openxmlformats.org/wordprocessingml/2006/main" xmlns:w14="http://schemas.microsoft.com/office/word/2010/wordml" xmlns:wpg="http://schemas.microsoft.com/office/word/2010/wordprocessingGroup" xmlns:wpi="http://schemas.microsoft.com/office/word/2010/wordprocessingInk" xmlns:wne="http://schemas.microsoft.com/office/word/2006/wordml" xmlns:wps="http://schemas.microsoft.com/office/word/2010/wordprocessingShape" mc:Ignorable="w14 wp14">
   <w:body>
+    <w:tbl>
+      <w:tblPr>
+        <w:tblW w:type="auto" w:w="0"/>
+        <w:tblLook w:firstColumn="1" w:firstRow="1" w:lastColumn="0" w:lastRow="0" w:noHBand="0" w:noVBand="1" w:val="04A0"/>
+      </w:tblPr>
+      <w:tblGrid>
+        <w:gridCol w:w="9406"/>
+      </w:tblGrid>
+      <w:tr>
+        <w:tc>
+          <w:tcPr>
+            <w:tcW w:type="dxa" w:w="9406"/>
+            <w:shd w:val="clear" w:color="auto" w:fill="1B5E20"/>
+          </w:tcPr>
+          <w:p>
+            <w:pPr>
+              <w:spacing w:before="280" w:after="280"/>
+            </w:pPr>
+            <w:r>
+              <w:rPr>
+                <w:b/>
+                <w:color w:val="FFFFFF"/>
+                <w:sz w:val="22"/>
+              </w:rPr>
+              <w:t xml:space="preserve">  TechCorp Industries — Hackathon IA 2026</w:t>
+            </w:r>
+          </w:p>
+        </w:tc>
+      </w:tr>
+    </w:tbl>
     <w:p/>
     <w:p/>
     <w:p/>
     <w:p>
       <w:pPr>
-        <w:jc w:val="center"/>
+        <w:jc w:val="left"/>
       </w:pPr>
       <w:r>
         <w:rPr>
           <w:b/>
-          <w:color w:val="1F497D"/>
-          <w:sz w:val="52"/>
+          <w:color w:val="1B5E20"/>
+          <w:sz w:val="56"/>
         </w:rPr>
         <w:t>RAPPORT DATA</w:t>
       </w:r>
     </w:p>
     <w:p>
+      <w:r>
+        <w:rPr>
+          <w:color w:val="E65C00"/>
+          <w:sz w:val="24"/>
+        </w:rPr>
+        <w:t>━━━━━━━━━━━━━━━━━━━━━━━━━━━━━━━━━━━━━━</w:t>
+      </w:r>
+    </w:p>
+    <w:p/>
+    <w:p>
       <w:pPr>
-        <w:jc w:val="center"/>
+        <w:jc w:val="left"/>
       </w:pPr>
       <w:r>
         <w:rPr>
-          <w:color w:val="2E74B5"/>
-          <w:sz w:val="28"/>
+          <w:i/>
+          <w:color w:val="212121"/>
+          <w:sz w:val="26"/>
         </w:rPr>
         <w:t>Analyse, nettoyage et qualité des datasets — TechCorp Industries</w:t>
       </w:r>
     </w:p>
     <w:p/>
+    <w:p/>
+    <w:p/>
     <w:p>
       <w:pPr>
-        <w:jc w:val="center"/>
+        <w:jc w:val="left"/>
       </w:pPr>
       <w:r>
         <w:rPr>
-          <w:color w:val="404040"/>
+          <w:b/>
+          <w:color w:val="E65C00"/>
           <w:sz w:val="22"/>
         </w:rPr>
-        <w:t>TechCorp Industries</w:t>
+        <w:t xml:space="preserve">Auteur : </w:t>
+      </w:r>
+      <w:r>
+        <w:rPr>
+          <w:color w:val="212121"/>
+          <w:sz w:val="22"/>
+        </w:rPr>
+        <w:t>Saidou COUMARE</w:t>
       </w:r>
     </w:p>
     <w:p>
       <w:pPr>
-        <w:jc w:val="center"/>
+        <w:jc w:val="left"/>
       </w:pPr>
       <w:r>
         <w:rPr>
-          <w:color w:val="404040"/>
+          <w:b/>
+          <w:color w:val="E65C00"/>
           <w:sz w:val="22"/>
         </w:rPr>
-        <w:t>Dépôt : github.com/lucille452/hackathon_ynov</w:t>
+        <w:t xml:space="preserve">Rôle : </w:t>
       </w:r>
-    </w:p>
-    <w:p>
-      <w:pPr>
-        <w:jc w:val="center"/>
-      </w:pPr>
       <w:r>
         <w:rPr>
-          <w:color w:val="404040"/>
-          <w:sz w:val="22"/>
-        </w:rPr>
-      </w:r>
-    </w:p>
-    <w:p>
-      <w:pPr>
-        <w:jc w:val="center"/>
-      </w:pPr>
-      <w:r>
-        <w:rPr>
-          <w:color w:val="404040"/>
+          <w:color w:val="212121"/>
           <w:sz w:val="22"/>
         </w:rPr>
         <w:t>Rôle : DATA  |  Version 1.0</w:t>
@@ -80,11 +116,19 @@
     </w:p>
     <w:p>
       <w:pPr>
-        <w:jc w:val="center"/>
+        <w:jc w:val="left"/>
       </w:pPr>
       <w:r>
         <w:rPr>
-          <w:color w:val="404040"/>
+          <w:b/>
+          <w:color w:val="E65C00"/>
+          <w:sz w:val="22"/>
+        </w:rPr>
+        <w:t xml:space="preserve">Date : </w:t>
+      </w:r>
+      <w:r>
+        <w:rPr>
+          <w:color w:val="212121"/>
           <w:sz w:val="22"/>
         </w:rPr>
         <w:t>Juillet 2026</w:t>
@@ -92,14 +136,22 @@
     </w:p>
     <w:p>
       <w:pPr>
-        <w:jc w:val="center"/>
+        <w:jc w:val="left"/>
       </w:pPr>
       <w:r>
         <w:rPr>
-          <w:color w:val="404040"/>
+          <w:b/>
+          <w:color w:val="E65C00"/>
           <w:sz w:val="22"/>
         </w:rPr>
-        <w:t>Saidou COUMARE</w:t>
+        <w:t xml:space="preserve">Dépôt : </w:t>
+      </w:r>
+      <w:r>
+        <w:rPr>
+          <w:color w:val="212121"/>
+          <w:sz w:val="22"/>
+        </w:rPr>
+        <w:t>github.com/lucille452/hackathon_ynov</w:t>
       </w:r>
     </w:p>
     <w:p>
@@ -109,14 +161,27 @@
     </w:p>
     <w:p>
       <w:pPr>
-        <w:pStyle w:val="Heading1"/>
+        <w:spacing w:before="320" w:after="40"/>
       </w:pPr>
       <w:r>
         <w:rPr>
-          <w:color w:val="1F497D"/>
+          <w:b/>
+          <w:color w:val="1B5E20"/>
           <w:sz w:val="28"/>
         </w:rPr>
         <w:t>1. Contexte et objectifs</w:t>
+      </w:r>
+    </w:p>
+    <w:p>
+      <w:pPr>
+        <w:spacing w:after="120"/>
+      </w:pPr>
+      <w:r>
+        <w:rPr>
+          <w:color w:val="E65C00"/>
+          <w:sz w:val="18"/>
+        </w:rPr>
+        <w:t>────────────────────────────────────────────────────────────</w:t>
       </w:r>
     </w:p>
     <w:p>
@@ -137,11 +202,12 @@
     </w:p>
     <w:p>
       <w:pPr>
-        <w:pStyle w:val="Heading1"/>
+        <w:spacing w:before="320" w:after="40"/>
       </w:pPr>
       <w:r>
         <w:rPr>
-          <w:color w:val="1F497D"/>
+          <w:b/>
+          <w:color w:val="1B5E20"/>
           <w:sz w:val="28"/>
         </w:rPr>
         <w:t>2. Datasets hérités — état initial</w:t>
@@ -149,12 +215,25 @@
     </w:p>
     <w:p>
       <w:pPr>
-        <w:pStyle w:val="Heading2"/>
+        <w:spacing w:after="120"/>
       </w:pPr>
       <w:r>
         <w:rPr>
-          <w:color w:val="2E74B5"/>
-          <w:sz w:val="24"/>
+          <w:color w:val="E65C00"/>
+          <w:sz w:val="18"/>
+        </w:rPr>
+        <w:t>────────────────────────────────────────────────────────────</w:t>
+      </w:r>
+    </w:p>
+    <w:p>
+      <w:pPr>
+        <w:spacing w:before="200"/>
+      </w:pPr>
+      <w:r>
+        <w:rPr>
+          <w:b/>
+          <w:color w:val="E65C00"/>
+          <w:sz w:val="22"/>
         </w:rPr>
         <w:t>2.1 Vue d'ensemble</w:t>
       </w:r>
@@ -163,7 +242,7 @@
       <w:tblPr>
         <w:tblStyle w:val="TableGrid"/>
         <w:tblW w:type="auto" w:w="0"/>
-        <w:jc w:val="center"/>
+        <w:jc w:val="left"/>
         <w:tblLook w:firstColumn="1" w:firstRow="1" w:lastColumn="0" w:lastRow="0" w:noHBand="0" w:noVBand="1" w:val="04A0"/>
       </w:tblPr>
       <w:tblGrid>
@@ -176,7 +255,7 @@
         <w:tc>
           <w:tcPr>
             <w:tcW w:type="dxa" w:w="2351"/>
-            <w:shd w:val="clear" w:color="auto" w:fill="1F497D"/>
+            <w:shd w:val="clear" w:color="auto" w:fill="1B5E20"/>
           </w:tcPr>
           <w:p>
             <w:r>
@@ -192,7 +271,7 @@
         <w:tc>
           <w:tcPr>
             <w:tcW w:type="dxa" w:w="2351"/>
-            <w:shd w:val="clear" w:color="auto" w:fill="1F497D"/>
+            <w:shd w:val="clear" w:color="auto" w:fill="1B5E20"/>
           </w:tcPr>
           <w:p>
             <w:r>
@@ -208,7 +287,7 @@
         <w:tc>
           <w:tcPr>
             <w:tcW w:type="dxa" w:w="2351"/>
-            <w:shd w:val="clear" w:color="auto" w:fill="1F497D"/>
+            <w:shd w:val="clear" w:color="auto" w:fill="1B5E20"/>
           </w:tcPr>
           <w:p>
             <w:r>
@@ -224,7 +303,7 @@
         <w:tc>
           <w:tcPr>
             <w:tcW w:type="dxa" w:w="2351"/>
-            <w:shd w:val="clear" w:color="auto" w:fill="1F497D"/>
+            <w:shd w:val="clear" w:color="auto" w:fill="1B5E20"/>
           </w:tcPr>
           <w:p>
             <w:r>
@@ -242,7 +321,7 @@
         <w:tc>
           <w:tcPr>
             <w:tcW w:type="dxa" w:w="2351"/>
-            <w:shd w:val="clear" w:color="auto" w:fill="DEEAF1"/>
+            <w:shd w:val="clear" w:color="auto" w:fill="E8F5E9"/>
           </w:tcPr>
           <w:p>
             <w:r>
@@ -256,7 +335,7 @@
         <w:tc>
           <w:tcPr>
             <w:tcW w:type="dxa" w:w="2351"/>
-            <w:shd w:val="clear" w:color="auto" w:fill="DEEAF1"/>
+            <w:shd w:val="clear" w:color="auto" w:fill="E8F5E9"/>
           </w:tcPr>
           <w:p>
             <w:r>
@@ -270,7 +349,7 @@
         <w:tc>
           <w:tcPr>
             <w:tcW w:type="dxa" w:w="2351"/>
-            <w:shd w:val="clear" w:color="auto" w:fill="DEEAF1"/>
+            <w:shd w:val="clear" w:color="auto" w:fill="E8F5E9"/>
           </w:tcPr>
           <w:p>
             <w:r>
@@ -284,7 +363,7 @@
         <w:tc>
           <w:tcPr>
             <w:tcW w:type="dxa" w:w="2351"/>
-            <w:shd w:val="clear" w:color="auto" w:fill="DEEAF1"/>
+            <w:shd w:val="clear" w:color="auto" w:fill="E8F5E9"/>
           </w:tcPr>
           <w:p>
             <w:r>
@@ -358,12 +437,13 @@
     <w:p/>
     <w:p>
       <w:pPr>
-        <w:pStyle w:val="Heading2"/>
+        <w:spacing w:before="200"/>
       </w:pPr>
       <w:r>
         <w:rPr>
-          <w:color w:val="2E74B5"/>
-          <w:sz w:val="24"/>
+          <w:b/>
+          <w:color w:val="E65C00"/>
+          <w:sz w:val="22"/>
         </w:rPr>
         <w:t>2.2 Découverte critique — dataset compromis</w:t>
       </w:r>
@@ -389,15 +469,16 @@
         <w:tc>
           <w:tcPr>
             <w:tcW w:type="dxa" w:w="9406"/>
-            <w:shd w:val="clear" w:color="auto" w:fill="FFF2CC"/>
+            <w:shd w:val="clear" w:color="auto" w:fill="FBE9E7"/>
           </w:tcPr>
           <w:p>
             <w:r>
               <w:rPr>
                 <w:b/>
-                <w:color w:val="C00000"/>
+                <w:color w:val="E65C00"/>
+                <w:sz w:val="22"/>
               </w:rPr>
-              <w:t>ALERTE SÉCURITÉ — Dataset financier compromis</w:t>
+              <w:t>⚠  ALERTE SÉCURITÉ — Dataset financier compromis</w:t>
               <w:br/>
             </w:r>
             <w:r>
@@ -453,11 +534,12 @@
     <w:p/>
     <w:p>
       <w:pPr>
-        <w:pStyle w:val="Heading1"/>
+        <w:spacing w:before="320" w:after="40"/>
       </w:pPr>
       <w:r>
         <w:rPr>
-          <w:color w:val="1F497D"/>
+          <w:b/>
+          <w:color w:val="1B5E20"/>
           <w:sz w:val="28"/>
         </w:rPr>
         <w:t>3. Analyse de qualité des données</w:t>
@@ -465,12 +547,25 @@
     </w:p>
     <w:p>
       <w:pPr>
-        <w:pStyle w:val="Heading2"/>
+        <w:spacing w:after="120"/>
       </w:pPr>
       <w:r>
         <w:rPr>
-          <w:color w:val="2E74B5"/>
-          <w:sz w:val="24"/>
+          <w:color w:val="E65C00"/>
+          <w:sz w:val="18"/>
+        </w:rPr>
+        <w:t>────────────────────────────────────────────────────────────</w:t>
+      </w:r>
+    </w:p>
+    <w:p>
+      <w:pPr>
+        <w:spacing w:before="200"/>
+      </w:pPr>
+      <w:r>
+        <w:rPr>
+          <w:b/>
+          <w:color w:val="E65C00"/>
+          <w:sz w:val="22"/>
         </w:rPr>
         <w:t>3.1 Dataset financier</w:t>
       </w:r>
@@ -479,7 +574,7 @@
       <w:tblPr>
         <w:tblStyle w:val="TableGrid"/>
         <w:tblW w:type="auto" w:w="0"/>
-        <w:jc w:val="center"/>
+        <w:jc w:val="left"/>
         <w:tblLook w:firstColumn="1" w:firstRow="1" w:lastColumn="0" w:lastRow="0" w:noHBand="0" w:noVBand="1" w:val="04A0"/>
       </w:tblPr>
       <w:tblGrid>
@@ -491,7 +586,7 @@
         <w:tc>
           <w:tcPr>
             <w:tcW w:type="dxa" w:w="3135"/>
-            <w:shd w:val="clear" w:color="auto" w:fill="1F497D"/>
+            <w:shd w:val="clear" w:color="auto" w:fill="1B5E20"/>
           </w:tcPr>
           <w:p>
             <w:r>
@@ -507,7 +602,7 @@
         <w:tc>
           <w:tcPr>
             <w:tcW w:type="dxa" w:w="3135"/>
-            <w:shd w:val="clear" w:color="auto" w:fill="1F497D"/>
+            <w:shd w:val="clear" w:color="auto" w:fill="1B5E20"/>
           </w:tcPr>
           <w:p>
             <w:r>
@@ -523,7 +618,7 @@
         <w:tc>
           <w:tcPr>
             <w:tcW w:type="dxa" w:w="3135"/>
-            <w:shd w:val="clear" w:color="auto" w:fill="1F497D"/>
+            <w:shd w:val="clear" w:color="auto" w:fill="1B5E20"/>
           </w:tcPr>
           <w:p>
             <w:r>
@@ -541,7 +636,7 @@
         <w:tc>
           <w:tcPr>
             <w:tcW w:type="dxa" w:w="3135"/>
-            <w:shd w:val="clear" w:color="auto" w:fill="DEEAF1"/>
+            <w:shd w:val="clear" w:color="auto" w:fill="E8F5E9"/>
           </w:tcPr>
           <w:p>
             <w:r>
@@ -555,7 +650,7 @@
         <w:tc>
           <w:tcPr>
             <w:tcW w:type="dxa" w:w="3135"/>
-            <w:shd w:val="clear" w:color="auto" w:fill="DEEAF1"/>
+            <w:shd w:val="clear" w:color="auto" w:fill="E8F5E9"/>
           </w:tcPr>
           <w:p>
             <w:r>
@@ -569,7 +664,7 @@
         <w:tc>
           <w:tcPr>
             <w:tcW w:type="dxa" w:w="3135"/>
-            <w:shd w:val="clear" w:color="auto" w:fill="DEEAF1"/>
+            <w:shd w:val="clear" w:color="auto" w:fill="E8F5E9"/>
           </w:tcPr>
           <w:p>
             <w:r>
@@ -629,7 +724,7 @@
         <w:tc>
           <w:tcPr>
             <w:tcW w:type="dxa" w:w="3135"/>
-            <w:shd w:val="clear" w:color="auto" w:fill="DEEAF1"/>
+            <w:shd w:val="clear" w:color="auto" w:fill="E8F5E9"/>
           </w:tcPr>
           <w:p>
             <w:r>
@@ -643,7 +738,7 @@
         <w:tc>
           <w:tcPr>
             <w:tcW w:type="dxa" w:w="3135"/>
-            <w:shd w:val="clear" w:color="auto" w:fill="DEEAF1"/>
+            <w:shd w:val="clear" w:color="auto" w:fill="E8F5E9"/>
           </w:tcPr>
           <w:p>
             <w:r>
@@ -657,7 +752,7 @@
         <w:tc>
           <w:tcPr>
             <w:tcW w:type="dxa" w:w="3135"/>
-            <w:shd w:val="clear" w:color="auto" w:fill="DEEAF1"/>
+            <w:shd w:val="clear" w:color="auto" w:fill="E8F5E9"/>
           </w:tcPr>
           <w:p>
             <w:r>
@@ -717,7 +812,7 @@
         <w:tc>
           <w:tcPr>
             <w:tcW w:type="dxa" w:w="3135"/>
-            <w:shd w:val="clear" w:color="auto" w:fill="DEEAF1"/>
+            <w:shd w:val="clear" w:color="auto" w:fill="E8F5E9"/>
           </w:tcPr>
           <w:p>
             <w:r>
@@ -731,7 +826,7 @@
         <w:tc>
           <w:tcPr>
             <w:tcW w:type="dxa" w:w="3135"/>
-            <w:shd w:val="clear" w:color="auto" w:fill="DEEAF1"/>
+            <w:shd w:val="clear" w:color="auto" w:fill="E8F5E9"/>
           </w:tcPr>
           <w:p>
             <w:r>
@@ -745,7 +840,7 @@
         <w:tc>
           <w:tcPr>
             <w:tcW w:type="dxa" w:w="3135"/>
-            <w:shd w:val="clear" w:color="auto" w:fill="DEEAF1"/>
+            <w:shd w:val="clear" w:color="auto" w:fill="E8F5E9"/>
           </w:tcPr>
           <w:p>
             <w:r>
@@ -761,12 +856,13 @@
     <w:p/>
     <w:p>
       <w:pPr>
-        <w:pStyle w:val="Heading2"/>
+        <w:spacing w:before="200"/>
       </w:pPr>
       <w:r>
         <w:rPr>
-          <w:color w:val="2E74B5"/>
-          <w:sz w:val="24"/>
+          <w:b/>
+          <w:color w:val="E65C00"/>
+          <w:sz w:val="22"/>
         </w:rPr>
         <w:t>3.2 Dataset médical</w:t>
       </w:r>
@@ -775,7 +871,7 @@
       <w:tblPr>
         <w:tblStyle w:val="TableGrid"/>
         <w:tblW w:type="auto" w:w="0"/>
-        <w:jc w:val="center"/>
+        <w:jc w:val="left"/>
         <w:tblLook w:firstColumn="1" w:firstRow="1" w:lastColumn="0" w:lastRow="0" w:noHBand="0" w:noVBand="1" w:val="04A0"/>
       </w:tblPr>
       <w:tblGrid>
@@ -787,7 +883,7 @@
         <w:tc>
           <w:tcPr>
             <w:tcW w:type="dxa" w:w="3135"/>
-            <w:shd w:val="clear" w:color="auto" w:fill="1F497D"/>
+            <w:shd w:val="clear" w:color="auto" w:fill="1B5E20"/>
           </w:tcPr>
           <w:p>
             <w:r>
@@ -803,7 +899,7 @@
         <w:tc>
           <w:tcPr>
             <w:tcW w:type="dxa" w:w="3135"/>
-            <w:shd w:val="clear" w:color="auto" w:fill="1F497D"/>
+            <w:shd w:val="clear" w:color="auto" w:fill="1B5E20"/>
           </w:tcPr>
           <w:p>
             <w:r>
@@ -819,7 +915,7 @@
         <w:tc>
           <w:tcPr>
             <w:tcW w:type="dxa" w:w="3135"/>
-            <w:shd w:val="clear" w:color="auto" w:fill="1F497D"/>
+            <w:shd w:val="clear" w:color="auto" w:fill="1B5E20"/>
           </w:tcPr>
           <w:p>
             <w:r>
@@ -837,7 +933,7 @@
         <w:tc>
           <w:tcPr>
             <w:tcW w:type="dxa" w:w="3135"/>
-            <w:shd w:val="clear" w:color="auto" w:fill="DEEAF1"/>
+            <w:shd w:val="clear" w:color="auto" w:fill="E8F5E9"/>
           </w:tcPr>
           <w:p>
             <w:r>
@@ -851,7 +947,7 @@
         <w:tc>
           <w:tcPr>
             <w:tcW w:type="dxa" w:w="3135"/>
-            <w:shd w:val="clear" w:color="auto" w:fill="DEEAF1"/>
+            <w:shd w:val="clear" w:color="auto" w:fill="E8F5E9"/>
           </w:tcPr>
           <w:p>
             <w:r>
@@ -865,7 +961,7 @@
         <w:tc>
           <w:tcPr>
             <w:tcW w:type="dxa" w:w="3135"/>
-            <w:shd w:val="clear" w:color="auto" w:fill="DEEAF1"/>
+            <w:shd w:val="clear" w:color="auto" w:fill="E8F5E9"/>
           </w:tcPr>
           <w:p>
             <w:r>
@@ -925,7 +1021,7 @@
         <w:tc>
           <w:tcPr>
             <w:tcW w:type="dxa" w:w="3135"/>
-            <w:shd w:val="clear" w:color="auto" w:fill="DEEAF1"/>
+            <w:shd w:val="clear" w:color="auto" w:fill="E8F5E9"/>
           </w:tcPr>
           <w:p>
             <w:r>
@@ -939,7 +1035,7 @@
         <w:tc>
           <w:tcPr>
             <w:tcW w:type="dxa" w:w="3135"/>
-            <w:shd w:val="clear" w:color="auto" w:fill="DEEAF1"/>
+            <w:shd w:val="clear" w:color="auto" w:fill="E8F5E9"/>
           </w:tcPr>
           <w:p>
             <w:r>
@@ -953,7 +1049,7 @@
         <w:tc>
           <w:tcPr>
             <w:tcW w:type="dxa" w:w="3135"/>
-            <w:shd w:val="clear" w:color="auto" w:fill="DEEAF1"/>
+            <w:shd w:val="clear" w:color="auto" w:fill="E8F5E9"/>
           </w:tcPr>
           <w:p>
             <w:r>
@@ -1049,11 +1145,12 @@
     <w:p/>
     <w:p>
       <w:pPr>
-        <w:pStyle w:val="Heading1"/>
+        <w:spacing w:before="320" w:after="40"/>
       </w:pPr>
       <w:r>
         <w:rPr>
-          <w:color w:val="1F497D"/>
+          <w:b/>
+          <w:color w:val="1B5E20"/>
           <w:sz w:val="28"/>
         </w:rPr>
         <w:t>4. Nettoyage et préparation</w:t>
@@ -1061,12 +1158,25 @@
     </w:p>
     <w:p>
       <w:pPr>
-        <w:pStyle w:val="Heading2"/>
+        <w:spacing w:after="120"/>
       </w:pPr>
       <w:r>
         <w:rPr>
-          <w:color w:val="2E74B5"/>
-          <w:sz w:val="24"/>
+          <w:color w:val="E65C00"/>
+          <w:sz w:val="18"/>
+        </w:rPr>
+        <w:t>────────────────────────────────────────────────────────────</w:t>
+      </w:r>
+    </w:p>
+    <w:p>
+      <w:pPr>
+        <w:spacing w:before="200"/>
+      </w:pPr>
+      <w:r>
+        <w:rPr>
+          <w:b/>
+          <w:color w:val="E65C00"/>
+          <w:sz w:val="22"/>
         </w:rPr>
         <w:t>4.1 Script de nettoyage</w:t>
       </w:r>
@@ -1081,12 +1191,13 @@
     </w:p>
     <w:p>
       <w:pPr>
-        <w:pStyle w:val="Heading2"/>
+        <w:spacing w:before="200"/>
       </w:pPr>
       <w:r>
         <w:rPr>
-          <w:color w:val="2E74B5"/>
-          <w:sz w:val="24"/>
+          <w:b/>
+          <w:color w:val="E65C00"/>
+          <w:sz w:val="22"/>
         </w:rPr>
         <w:t>4.2 Résultats après nettoyage</w:t>
       </w:r>
@@ -1095,7 +1206,7 @@
       <w:tblPr>
         <w:tblStyle w:val="TableGrid"/>
         <w:tblW w:type="auto" w:w="0"/>
-        <w:jc w:val="center"/>
+        <w:jc w:val="left"/>
         <w:tblLook w:firstColumn="1" w:firstRow="1" w:lastColumn="0" w:lastRow="0" w:noHBand="0" w:noVBand="1" w:val="04A0"/>
       </w:tblPr>
       <w:tblGrid>
@@ -1109,7 +1220,7 @@
         <w:tc>
           <w:tcPr>
             <w:tcW w:type="dxa" w:w="1881"/>
-            <w:shd w:val="clear" w:color="auto" w:fill="1F497D"/>
+            <w:shd w:val="clear" w:color="auto" w:fill="1B5E20"/>
           </w:tcPr>
           <w:p>
             <w:r>
@@ -1125,7 +1236,7 @@
         <w:tc>
           <w:tcPr>
             <w:tcW w:type="dxa" w:w="1881"/>
-            <w:shd w:val="clear" w:color="auto" w:fill="1F497D"/>
+            <w:shd w:val="clear" w:color="auto" w:fill="1B5E20"/>
           </w:tcPr>
           <w:p>
             <w:r>
@@ -1141,7 +1252,7 @@
         <w:tc>
           <w:tcPr>
             <w:tcW w:type="dxa" w:w="1881"/>
-            <w:shd w:val="clear" w:color="auto" w:fill="1F497D"/>
+            <w:shd w:val="clear" w:color="auto" w:fill="1B5E20"/>
           </w:tcPr>
           <w:p>
             <w:r>
@@ -1157,7 +1268,7 @@
         <w:tc>
           <w:tcPr>
             <w:tcW w:type="dxa" w:w="1881"/>
-            <w:shd w:val="clear" w:color="auto" w:fill="1F497D"/>
+            <w:shd w:val="clear" w:color="auto" w:fill="1B5E20"/>
           </w:tcPr>
           <w:p>
             <w:r>
@@ -1173,7 +1284,7 @@
         <w:tc>
           <w:tcPr>
             <w:tcW w:type="dxa" w:w="1881"/>
-            <w:shd w:val="clear" w:color="auto" w:fill="1F497D"/>
+            <w:shd w:val="clear" w:color="auto" w:fill="1B5E20"/>
           </w:tcPr>
           <w:p>
             <w:r>
@@ -1191,7 +1302,7 @@
         <w:tc>
           <w:tcPr>
             <w:tcW w:type="dxa" w:w="1881"/>
-            <w:shd w:val="clear" w:color="auto" w:fill="DEEAF1"/>
+            <w:shd w:val="clear" w:color="auto" w:fill="E8F5E9"/>
           </w:tcPr>
           <w:p>
             <w:r>
@@ -1205,7 +1316,7 @@
         <w:tc>
           <w:tcPr>
             <w:tcW w:type="dxa" w:w="1881"/>
-            <w:shd w:val="clear" w:color="auto" w:fill="DEEAF1"/>
+            <w:shd w:val="clear" w:color="auto" w:fill="E8F5E9"/>
           </w:tcPr>
           <w:p>
             <w:r>
@@ -1219,7 +1330,7 @@
         <w:tc>
           <w:tcPr>
             <w:tcW w:type="dxa" w:w="1881"/>
-            <w:shd w:val="clear" w:color="auto" w:fill="DEEAF1"/>
+            <w:shd w:val="clear" w:color="auto" w:fill="E8F5E9"/>
           </w:tcPr>
           <w:p>
             <w:r>
@@ -1233,7 +1344,7 @@
         <w:tc>
           <w:tcPr>
             <w:tcW w:type="dxa" w:w="1881"/>
-            <w:shd w:val="clear" w:color="auto" w:fill="DEEAF1"/>
+            <w:shd w:val="clear" w:color="auto" w:fill="E8F5E9"/>
           </w:tcPr>
           <w:p>
             <w:r>
@@ -1247,7 +1358,7 @@
         <w:tc>
           <w:tcPr>
             <w:tcW w:type="dxa" w:w="1881"/>
-            <w:shd w:val="clear" w:color="auto" w:fill="DEEAF1"/>
+            <w:shd w:val="clear" w:color="auto" w:fill="E8F5E9"/>
           </w:tcPr>
           <w:p>
             <w:r>
@@ -1379,21 +1490,34 @@
     <w:p/>
     <w:p>
       <w:pPr>
-        <w:pStyle w:val="Heading1"/>
+        <w:spacing w:before="320" w:after="40"/>
       </w:pPr>
       <w:r>
         <w:rPr>
-          <w:color w:val="1F497D"/>
+          <w:b/>
+          <w:color w:val="1B5E20"/>
           <w:sz w:val="28"/>
         </w:rPr>
         <w:t>5. Fichiers livrés</w:t>
+      </w:r>
+    </w:p>
+    <w:p>
+      <w:pPr>
+        <w:spacing w:after="120"/>
+      </w:pPr>
+      <w:r>
+        <w:rPr>
+          <w:color w:val="E65C00"/>
+          <w:sz w:val="18"/>
+        </w:rPr>
+        <w:t>────────────────────────────────────────────────────────────</w:t>
       </w:r>
     </w:p>
     <w:tbl>
       <w:tblPr>
         <w:tblStyle w:val="TableGrid"/>
         <w:tblW w:type="auto" w:w="0"/>
-        <w:jc w:val="center"/>
+        <w:jc w:val="left"/>
         <w:tblLook w:firstColumn="1" w:firstRow="1" w:lastColumn="0" w:lastRow="0" w:noHBand="0" w:noVBand="1" w:val="04A0"/>
       </w:tblPr>
       <w:tblGrid>
@@ -1404,7 +1528,7 @@
         <w:tc>
           <w:tcPr>
             <w:tcW w:type="dxa" w:w="4703"/>
-            <w:shd w:val="clear" w:color="auto" w:fill="1F497D"/>
+            <w:shd w:val="clear" w:color="auto" w:fill="1B5E20"/>
           </w:tcPr>
           <w:p>
             <w:r>
@@ -1420,7 +1544,7 @@
         <w:tc>
           <w:tcPr>
             <w:tcW w:type="dxa" w:w="4703"/>
-            <w:shd w:val="clear" w:color="auto" w:fill="1F497D"/>
+            <w:shd w:val="clear" w:color="auto" w:fill="1B5E20"/>
           </w:tcPr>
           <w:p>
             <w:r>
@@ -1438,7 +1562,7 @@
         <w:tc>
           <w:tcPr>
             <w:tcW w:type="dxa" w:w="4703"/>
-            <w:shd w:val="clear" w:color="auto" w:fill="DEEAF1"/>
+            <w:shd w:val="clear" w:color="auto" w:fill="E8F5E9"/>
           </w:tcPr>
           <w:p>
             <w:r>
@@ -1452,7 +1576,7 @@
         <w:tc>
           <w:tcPr>
             <w:tcW w:type="dxa" w:w="4703"/>
-            <w:shd w:val="clear" w:color="auto" w:fill="DEEAF1"/>
+            <w:shd w:val="clear" w:color="auto" w:fill="E8F5E9"/>
           </w:tcPr>
           <w:p>
             <w:r>
@@ -1498,7 +1622,7 @@
         <w:tc>
           <w:tcPr>
             <w:tcW w:type="dxa" w:w="4703"/>
-            <w:shd w:val="clear" w:color="auto" w:fill="DEEAF1"/>
+            <w:shd w:val="clear" w:color="auto" w:fill="E8F5E9"/>
           </w:tcPr>
           <w:p>
             <w:r>
@@ -1512,7 +1636,7 @@
         <w:tc>
           <w:tcPr>
             <w:tcW w:type="dxa" w:w="4703"/>
-            <w:shd w:val="clear" w:color="auto" w:fill="DEEAF1"/>
+            <w:shd w:val="clear" w:color="auto" w:fill="E8F5E9"/>
           </w:tcPr>
           <w:p>
             <w:r>
@@ -1566,21 +1690,34 @@
     </w:p>
     <w:p>
       <w:pPr>
-        <w:pStyle w:val="Heading1"/>
+        <w:spacing w:before="320" w:after="40"/>
       </w:pPr>
       <w:r>
         <w:rPr>
-          <w:color w:val="1F497D"/>
+          <w:b/>
+          <w:color w:val="1B5E20"/>
           <w:sz w:val="28"/>
         </w:rPr>
         <w:t>6. Synthèse</w:t>
+      </w:r>
+    </w:p>
+    <w:p>
+      <w:pPr>
+        <w:spacing w:after="120"/>
+      </w:pPr>
+      <w:r>
+        <w:rPr>
+          <w:color w:val="E65C00"/>
+          <w:sz w:val="18"/>
+        </w:rPr>
+        <w:t>────────────────────────────────────────────────────────────</w:t>
       </w:r>
     </w:p>
     <w:tbl>
       <w:tblPr>
         <w:tblStyle w:val="TableGrid"/>
         <w:tblW w:type="auto" w:w="0"/>
-        <w:jc w:val="center"/>
+        <w:jc w:val="left"/>
         <w:tblLook w:firstColumn="1" w:firstRow="1" w:lastColumn="0" w:lastRow="0" w:noHBand="0" w:noVBand="1" w:val="04A0"/>
       </w:tblPr>
       <w:tblGrid>
@@ -1591,7 +1728,7 @@
         <w:tc>
           <w:tcPr>
             <w:tcW w:type="dxa" w:w="4703"/>
-            <w:shd w:val="clear" w:color="auto" w:fill="1F497D"/>
+            <w:shd w:val="clear" w:color="auto" w:fill="1B5E20"/>
           </w:tcPr>
           <w:p>
             <w:r>
@@ -1607,7 +1744,7 @@
         <w:tc>
           <w:tcPr>
             <w:tcW w:type="dxa" w:w="4703"/>
-            <w:shd w:val="clear" w:color="auto" w:fill="1F497D"/>
+            <w:shd w:val="clear" w:color="auto" w:fill="1B5E20"/>
           </w:tcPr>
           <w:p>
             <w:r>
@@ -1625,7 +1762,7 @@
         <w:tc>
           <w:tcPr>
             <w:tcW w:type="dxa" w:w="4703"/>
-            <w:shd w:val="clear" w:color="auto" w:fill="DEEAF1"/>
+            <w:shd w:val="clear" w:color="auto" w:fill="E8F5E9"/>
           </w:tcPr>
           <w:p>
             <w:r>
@@ -1639,7 +1776,7 @@
         <w:tc>
           <w:tcPr>
             <w:tcW w:type="dxa" w:w="4703"/>
-            <w:shd w:val="clear" w:color="auto" w:fill="DEEAF1"/>
+            <w:shd w:val="clear" w:color="auto" w:fill="E8F5E9"/>
           </w:tcPr>
           <w:p>
             <w:r>
@@ -1685,7 +1822,7 @@
         <w:tc>
           <w:tcPr>
             <w:tcW w:type="dxa" w:w="4703"/>
-            <w:shd w:val="clear" w:color="auto" w:fill="DEEAF1"/>
+            <w:shd w:val="clear" w:color="auto" w:fill="E8F5E9"/>
           </w:tcPr>
           <w:p>
             <w:r>
@@ -1699,7 +1836,7 @@
         <w:tc>
           <w:tcPr>
             <w:tcW w:type="dxa" w:w="4703"/>
-            <w:shd w:val="clear" w:color="auto" w:fill="DEEAF1"/>
+            <w:shd w:val="clear" w:color="auto" w:fill="E8F5E9"/>
           </w:tcPr>
           <w:p>
             <w:r>
@@ -1745,7 +1882,7 @@
         <w:tc>
           <w:tcPr>
             <w:tcW w:type="dxa" w:w="4703"/>
-            <w:shd w:val="clear" w:color="auto" w:fill="DEEAF1"/>
+            <w:shd w:val="clear" w:color="auto" w:fill="E8F5E9"/>
           </w:tcPr>
           <w:p>
             <w:r>
@@ -1759,7 +1896,7 @@
         <w:tc>
           <w:tcPr>
             <w:tcW w:type="dxa" w:w="4703"/>
-            <w:shd w:val="clear" w:color="auto" w:fill="DEEAF1"/>
+            <w:shd w:val="clear" w:color="auto" w:fill="E8F5E9"/>
           </w:tcPr>
           <w:p>
             <w:r>

</xml_diff>